<commit_message>
Tailor CV and application for Biometric Officer role at Simba Group
</commit_message>
<xml_diff>
--- a/application-letter.docx
+++ b/application-letter.docx
@@ -3,299 +3,118 @@
 <w:document xmlns:wpc="http://schemas.microsoft.com/office/word/2010/wordprocessingCanvas" xmlns:cx="http://schemas.microsoft.com/office/drawing/2014/chartex" xmlns:cx1="http://schemas.microsoft.com/office/drawing/2015/9/8/chartex" xmlns:cx2="http://schemas.microsoft.com/office/drawing/2015/10/21/chartex" xmlns:cx3="http://schemas.microsoft.com/office/drawing/2016/5/9/chartex" xmlns:cx4="http://schemas.microsoft.com/office/drawing/2016/5/10/chartex" xmlns:cx5="http://schemas.microsoft.com/office/drawing/2016/5/11/chartex" xmlns:cx6="http://schemas.microsoft.com/office/drawing/2016/5/12/chartex" xmlns:cx7="http://schemas.microsoft.com/office/drawing/2016/5/13/chartex" xmlns:cx8="http://schemas.microsoft.com/office/drawing/2016/5/14/chartex" xmlns:mc="http://schemas.openxmlformats.org/markup-compatibility/2006" xmlns:aink="http://schemas.microsoft.com/office/drawing/2016/ink" xmlns:am3d="http://schemas.microsoft.com/office/drawing/2017/model3d" xmlns:o="urn:schemas-microsoft-com:office:office" xmlns:r="http://schemas.openxmlformats.org/officeDocument/2006/relationships" xmlns:m="http://schemas.openxmlformats.org/officeDocument/2006/math" xmlns:v="urn:schemas-microsoft-com:vml" xmlns:wp14="http://schemas.microsoft.com/office/word/2010/wordprocessingDrawing" xmlns:wp="http://schemas.openxmlformats.org/drawingml/2006/wordprocessingDrawing" xmlns:w10="urn:schemas-microsoft-com:office:word" xmlns:w="http://schemas.openxmlformats.org/wordprocessingml/2006/main" xmlns:w14="http://schemas.microsoft.com/office/word/2010/wordml" xmlns:w15="http://schemas.microsoft.com/office/word/2012/wordml" xmlns:w16cid="http://schemas.microsoft.com/office/word/2016/wordml/cid" xmlns:w16se="http://schemas.microsoft.com/office/word/2015/wordml/symex" xmlns:wpg="http://schemas.microsoft.com/office/word/2010/wordprocessingGroup" xmlns:wpi="http://schemas.microsoft.com/office/word/2010/wordprocessingInk" xmlns:wne="http://schemas.microsoft.com/office/word/2006/wordml" xmlns:wps="http://schemas.microsoft.com/office/word/2010/wordprocessingShape" mc:Ignorable="w14 w15 w16se w16cid wp14">
   <w:body>
     <w:p>
-      <w:pPr>
-        <w:jc w:val="center"/>
-        <w:rPr>
-          <w:rFonts w:ascii="Calibri" w:hAnsi="Calibri" w:cs="Calibri"/>
-          <w:b/>
-          <w:sz w:val="40"/>
-        </w:rPr>
-      </w:pPr>
-      <w:r>
-        <w:rPr>
-          <w:rFonts w:ascii="Calibri" w:hAnsi="Calibri" w:cs="Calibri"/>
-          <w:b/>
-          <w:sz w:val="40"/>
-        </w:rPr>
-        <w:t>JONDU JESSE</w:t>
-      </w:r>
-    </w:p>
-    <w:p>
-      <w:pPr>
-        <w:jc w:val="center"/>
-        <w:rPr>
-          <w:rFonts w:ascii="Calibri" w:hAnsi="Calibri" w:cs="Calibri"/>
-          <w:sz w:val="20"/>
-        </w:rPr>
-      </w:pPr>
-      <w:r>
-        <w:rPr>
-          <w:rFonts w:ascii="Calibri" w:hAnsi="Calibri" w:cs="Calibri"/>
-          <w:sz w:val="20"/>
-        </w:rPr>
-        <w:t>Kampala, Uganda | +256 754 490 237 | jondujesse@gmail.com</w:t>
-      </w:r>
-    </w:p>
-    <w:p>
-      <w:pPr>
-        <w:jc w:val="center"/>
-        <w:rPr>
-          <w:rFonts w:ascii="Calibri" w:hAnsi="Calibri" w:cs="Calibri"/>
-          <w:sz w:val="20"/>
-        </w:rPr>
-      </w:pPr>
-      <w:r>
-        <w:rPr>
-          <w:rFonts w:ascii="Calibri" w:hAnsi="Calibri" w:cs="Calibri"/>
-          <w:sz w:val="20"/>
-        </w:rPr>
+      <w:r>
+        <w:t>Jondu Jesse</w:t>
+      </w:r>
+    </w:p>
+    <w:p>
+      <w:r>
+        <w:t>Kampala, Uganda</w:t>
+      </w:r>
+    </w:p>
+    <w:p>
+      <w:r>
+        <w:t>jondujesse@gmail.com | +256 754 490 237</w:t>
+      </w:r>
+    </w:p>
+    <w:p>
+      <w:r>
         <w:t>Portfolio: https://portfolio-5b977.web.app/</w:t>
       </w:r>
     </w:p>
-    <w:p>
-      <w:pPr>
-        <w:jc w:val="center"/>
-        <w:rPr>
-          <w:rFonts w:ascii="Calibri" w:hAnsi="Calibri" w:cs="Calibri"/>
-          <w:sz w:val="20"/>
-        </w:rPr>
-      </w:pPr>
-    </w:p>
-    <w:p>
-      <w:pPr>
-        <w:rPr>
-          <w:rFonts w:ascii="Calibri" w:hAnsi="Calibri" w:cs="Calibri"/>
-        </w:rPr>
-      </w:pPr>
-      <w:r>
-        <w:rPr>
-          <w:rFonts w:ascii="Calibri" w:hAnsi="Calibri" w:cs="Calibri"/>
-        </w:rPr>
-        <w:t>May 7, 2026</w:t>
-      </w:r>
-    </w:p>
-    <w:p>
-      <w:pPr>
-        <w:rPr>
-          <w:rFonts w:ascii="Calibri" w:hAnsi="Calibri" w:cs="Calibri"/>
-        </w:rPr>
-      </w:pPr>
-    </w:p>
-    <w:p>
-      <w:pPr>
-        <w:rPr>
-          <w:rFonts w:ascii="Calibri" w:hAnsi="Calibri" w:cs="Calibri"/>
-        </w:rPr>
-      </w:pPr>
-      <w:r>
-        <w:rPr>
-          <w:rFonts w:ascii="Calibri" w:hAnsi="Calibri" w:cs="Calibri"/>
-        </w:rPr>
+    <w:p/>
+    <w:p>
+      <w:r>
+        <w:t>June 12, 2026</w:t>
+      </w:r>
+    </w:p>
+    <w:p/>
+    <w:p>
+      <w:r>
         <w:t>Hiring Manager</w:t>
       </w:r>
     </w:p>
     <w:p>
-      <w:pPr>
-        <w:rPr>
-          <w:rFonts w:ascii="Calibri" w:hAnsi="Calibri" w:cs="Calibri"/>
-        </w:rPr>
-      </w:pPr>
-      <w:r>
-        <w:rPr>
-          <w:rFonts w:ascii="Calibri" w:hAnsi="Calibri" w:cs="Calibri"/>
-        </w:rPr>
-        <w:t>Thraets</w:t>
-      </w:r>
-    </w:p>
-    <w:p>
-      <w:pPr>
-        <w:rPr>
-          <w:rFonts w:ascii="Calibri" w:hAnsi="Calibri" w:cs="Calibri"/>
-        </w:rPr>
-      </w:pPr>
-    </w:p>
-    <w:p>
-      <w:pPr>
-        <w:rPr>
-          <w:rFonts w:ascii="Calibri" w:hAnsi="Calibri" w:cs="Calibri"/>
-          <w:b/>
-        </w:rPr>
-      </w:pPr>
-      <w:r>
-        <w:rPr>
-          <w:rFonts w:ascii="Calibri" w:hAnsi="Calibri" w:cs="Calibri"/>
-          <w:b/>
-        </w:rPr>
-        <w:t>RE: Application for Junior Developer / Designer Position</w:t>
-      </w:r>
-    </w:p>
-    <w:p>
-      <w:pPr>
-        <w:rPr>
-          <w:rFonts w:ascii="Calibri" w:hAnsi="Calibri" w:cs="Calibri"/>
-          <w:b/>
-        </w:rPr>
-      </w:pPr>
-    </w:p>
-    <w:p>
-      <w:pPr>
-        <w:rPr>
-          <w:rFonts w:ascii="Calibri" w:hAnsi="Calibri" w:cs="Calibri"/>
-        </w:rPr>
-      </w:pPr>
-      <w:r>
-        <w:rPr>
-          <w:rFonts w:ascii="Calibri" w:hAnsi="Calibri" w:cs="Calibri"/>
-        </w:rPr>
+      <w:r>
+        <w:t>Simba Group</w:t>
+      </w:r>
+    </w:p>
+    <w:p>
+      <w:r>
+        <w:t>Kampala, Uganda</w:t>
+      </w:r>
+    </w:p>
+    <w:p/>
+    <w:p>
+      <w:r>
+        <w:t>RE: Application for Biometric Officer Position (Ref: SG-VAS-UG-06-04)</w:t>
+      </w:r>
+    </w:p>
+    <w:p/>
+    <w:p>
+      <w:r>
         <w:t>Dear Hiring Manager,</w:t>
       </w:r>
     </w:p>
-    <w:p>
-      <w:pPr>
-        <w:rPr>
-          <w:rFonts w:ascii="Calibri" w:hAnsi="Calibri" w:cs="Calibri"/>
-        </w:rPr>
-      </w:pPr>
-    </w:p>
-    <w:p>
-      <w:pPr>
-        <w:rPr>
-          <w:rFonts w:ascii="Calibri" w:hAnsi="Calibri" w:cs="Calibri"/>
-        </w:rPr>
-      </w:pPr>
-      <w:r>
-        <w:rPr>
-          <w:rFonts w:ascii="Calibri" w:hAnsi="Calibri" w:cs="Calibri"/>
-        </w:rPr>
-        <w:t>I am writing to express my interest in the Junior Developer / Designer position at Thraets. As a creative IT specialist and digital content creator based in Kampala, I bring hands-on experience in full-stack web development, graphics design, and AI-assisted project delivery.</w:t>
-      </w:r>
-    </w:p>
-    <w:p>
-      <w:pPr>
-        <w:rPr>
-          <w:rFonts w:ascii="Calibri" w:hAnsi="Calibri" w:cs="Calibri"/>
-        </w:rPr>
-      </w:pPr>
-    </w:p>
-    <w:p>
-      <w:pPr>
-        <w:rPr>
-          <w:rFonts w:ascii="Calibri" w:hAnsi="Calibri" w:cs="Calibri"/>
-        </w:rPr>
-      </w:pPr>
-      <w:r>
-        <w:rPr>
-          <w:rFonts w:ascii="Calibri" w:hAnsi="Calibri" w:cs="Calibri"/>
-        </w:rPr>
-        <w:t>I have built and deployed a range of applications including a college events management system (PHP/MySQL), a church registration system (Firebase), a React-based image gallery, a dairy management system, and an SMS notification system. I leverage AI tools like Claude, ChatGPT, and Copilot to accelerate development, debug code, and deliver high-quality results faster.</w:t>
-      </w:r>
-    </w:p>
-    <w:p>
-      <w:pPr>
-        <w:rPr>
-          <w:rFonts w:ascii="Calibri" w:hAnsi="Calibri" w:cs="Calibri"/>
-        </w:rPr>
-      </w:pPr>
-    </w:p>
-    <w:p>
-      <w:pPr>
-        <w:rPr>
-          <w:rFonts w:ascii="Calibri" w:hAnsi="Calibri" w:cs="Calibri"/>
-        </w:rPr>
-      </w:pPr>
-      <w:r>
-        <w:rPr>
-          <w:rFonts w:ascii="Calibri" w:hAnsi="Calibri" w:cs="Calibri"/>
-        </w:rPr>
-        <w:t>Beyond development, I produce video content, design graphics, and manage live streaming as part of my work with Encounter Church media team. I am currently pursuing a Diploma in Information Technology at ISBAT University.</w:t>
-      </w:r>
-    </w:p>
-    <w:p>
-      <w:pPr>
-        <w:rPr>
-          <w:rFonts w:ascii="Calibri" w:hAnsi="Calibri" w:cs="Calibri"/>
-        </w:rPr>
-      </w:pPr>
-    </w:p>
-    <w:p>
-      <w:pPr>
-        <w:rPr>
-          <w:rFonts w:ascii="Calibri" w:hAnsi="Calibri" w:cs="Calibri"/>
-        </w:rPr>
-      </w:pPr>
-      <w:r>
-        <w:rPr>
-          <w:rFonts w:ascii="Calibri" w:hAnsi="Calibri" w:cs="Calibri"/>
-        </w:rPr>
-        <w:t>I am confident that my technical skills, creativity, and passion for building impactful digital solutions make me a strong fit for this role. I would welcome the opportunity to discuss how I can contribute to the team at Thraets.</w:t>
-      </w:r>
-    </w:p>
-    <w:p>
-      <w:pPr>
-        <w:rPr>
-          <w:rFonts w:ascii="Calibri" w:hAnsi="Calibri" w:cs="Calibri"/>
-        </w:rPr>
-      </w:pPr>
-    </w:p>
-    <w:p>
-      <w:pPr>
-        <w:rPr>
-          <w:rFonts w:ascii="Calibri" w:hAnsi="Calibri" w:cs="Calibri"/>
-        </w:rPr>
-      </w:pPr>
-      <w:r>
-        <w:rPr>
-          <w:rFonts w:ascii="Calibri" w:hAnsi="Calibri" w:cs="Calibri"/>
-        </w:rPr>
-        <w:t>Thank you for your time and consideration.</w:t>
-      </w:r>
-    </w:p>
-    <w:p>
-      <w:pPr>
-        <w:rPr>
-          <w:rFonts w:ascii="Calibri" w:hAnsi="Calibri" w:cs="Calibri"/>
-        </w:rPr>
-      </w:pPr>
-    </w:p>
-    <w:p>
-      <w:pPr>
-        <w:rPr>
-          <w:rFonts w:ascii="Calibri" w:hAnsi="Calibri" w:cs="Calibri"/>
-        </w:rPr>
-      </w:pPr>
-      <w:r>
-        <w:rPr>
-          <w:rFonts w:ascii="Calibri" w:hAnsi="Calibri" w:cs="Calibri"/>
-        </w:rPr>
+    <w:p/>
+    <w:p>
+      <w:r>
+        <w:t>I am writing to apply for the Biometric Officer position at Simba Group, as advertised. I bring hands-on experience in biometric data collection systems, customer service operations, and IT equipment management combined with fluency in English and Luganda.</w:t>
+      </w:r>
+    </w:p>
+    <w:p/>
+    <w:p>
+      <w:r>
+        <w:t>I recently developed a biometric enrollment and identity verification system (UPDMS) that includes fingerprint capture via browser-based API, webcam photo acquisition, and OCR-based ID document scanning using Tesseract.js. This project required precision, attention to data security, and a workflow designed for accuracy directly aligning with the responsibilities of collecting biometric data for Visa Application Centre operations.</w:t>
+      </w:r>
+    </w:p>
+    <w:p/>
+    <w:p>
+      <w:r>
+        <w:t>In my IT support and media work, I have:</w:t>
+      </w:r>
+    </w:p>
+    <w:p>
+      <w:r>
+        <w:t>- Operated and maintained technical equipment in fast-paced, customer-facing environments</w:t>
+      </w:r>
+    </w:p>
+    <w:p>
+      <w:r>
+        <w:t>- Assisted applicants and users through processes with patience and clear communication</w:t>
+      </w:r>
+    </w:p>
+    <w:p>
+      <w:r>
+        <w:t>- Managed sensitive data with strict confidentiality</w:t>
+      </w:r>
+    </w:p>
+    <w:p>
+      <w:r>
+        <w:t>- Collaborated with diverse teams across cultural backgrounds</w:t>
+      </w:r>
+    </w:p>
+    <w:p/>
+    <w:p>
+      <w:r>
+        <w:t>I hold a Diploma in Information Technology from ISBAT University and I am available to start immediately. I am confident that my technical background, customer service orientation, and fluency in both English and Luganda make me a strong candidate for this role.</w:t>
+      </w:r>
+    </w:p>
+    <w:p/>
+    <w:p>
+      <w:r>
+        <w:t>I would welcome the opportunity to discuss how my skills can contribute to the Simba Group team. Thank you for your consideration.</w:t>
+      </w:r>
+    </w:p>
+    <w:p/>
+    <w:p>
+      <w:r>
         <w:t>Yours sincerely,</w:t>
       </w:r>
     </w:p>
-    <w:p>
-      <w:pPr>
-        <w:rPr>
-          <w:rFonts w:ascii="Calibri" w:hAnsi="Calibri" w:cs="Calibri"/>
-        </w:rPr>
-      </w:pPr>
-    </w:p>
-    <w:p>
-      <w:pPr>
-        <w:rPr>
-          <w:rFonts w:ascii="Calibri" w:hAnsi="Calibri" w:cs="Calibri"/>
-        </w:rPr>
-      </w:pPr>
-    </w:p>
-    <w:p>
-      <w:pPr>
-        <w:rPr>
-          <w:rFonts w:ascii="Calibri" w:hAnsi="Calibri" w:cs="Calibri"/>
-          <w:b/>
-        </w:rPr>
-      </w:pPr>
-      <w:r>
-        <w:rPr>
-          <w:rFonts w:ascii="Calibri" w:hAnsi="Calibri" w:cs="Calibri"/>
-          <w:b/>
-        </w:rPr>
+    <w:p/>
+    <w:p>
+      <w:r>
         <w:t>Jondu Jesse</w:t>
       </w:r>
       <w:bookmarkStart w:id="0" w:name="_GoBack"/>

</xml_diff>